<commit_message>
Update role to Senior Product Manager, add leadership & RF skills
- Portfolio: Updated hero tagline, badges, Mini-Circuits title & bullets,
  professional summary, and skills section with PM/leadership/RF focus
- Resume: Updated title, summary, competencies, and experience bullets
  to reflect senior leadership role and expanded RF expertise

Co-Authored-By: Claude Opus 4.6 <noreply@anthropic.com>
</commit_message>
<xml_diff>
--- a/Revanth_Kondaveti_Resume.docx
+++ b/Revanth_Kondaveti_Resume.docx
@@ -134,7 +134,7 @@
           <w:sz w:val="20"/>
           <w:szCs w:val="20"/>
         </w:rPr>
-        <w:t xml:space="preserve">Results-driven engineer and product builder with 5+ years of experience shipping products at the intersection of AI/ML, hardware systems, and technical product management. Launched 100+ RF/semiconductor products to market, shipped industry-first 2nm defect metrology systems, and drove wireless platform optimization for Meta's AR/VR products with $200M+ revenue impact. Built 12+ AI-powered software products end-to-end, including autonomous trading systems, data center optimization platforms (R²=0.95+), and multi-agent LLM applications. Led cross-functional teams of 10+ engineers, managed product roadmaps from concept to launch, and published 10 peer-reviewed research papers. Certified Scrum Master. Founded two technology startups. MS Electrical Engineering, USC.</w:t>
+        <w:t xml:space="preserve">Senior Product Manager and technical leader with 5+ years driving product strategy, cross-functional execution, and innovation at the intersection of AI/ML, RF/semiconductor systems, and technical program management. Promoted to lead product launches across 100+ RF/semiconductor products at Mini-Circuits, managing a 10,000+ SKU portfolio while mentoring engineering teams and driving go-to-market strategy across AI, 5G, CATV, and DOCSIS 4.0 verticals. Shipped industry-first 2nm metrology systems at KLA and drove wireless platform optimization for Meta’s AR/VR products ($200M+ revenue impact). Built 12+ AI-powered products end-to-end. Led cross-functional teams of 10+ engineers, published 10 peer-reviewed research papers. Certified Scrum Master. Founded two startups. MS Electrical Engineering, USC.</w:t>
       </w:r>
     </w:p>
     <w:p>
@@ -195,16 +195,16 @@
           <w:sz w:val="20"/>
           <w:szCs w:val="20"/>
         </w:rPr>
-        <w:t xml:space="preserve">Product Management: </w:t>
-      </w:r>
-      <w:r>
-        <w:rPr>
-          <w:rFonts w:ascii="Calibri" w:cs="Calibri" w:eastAsia="Calibri" w:hAnsi="Calibri"/>
-          <w:color w:val="000000"/>
-          <w:sz w:val="20"/>
-          <w:szCs w:val="20"/>
-        </w:rPr>
-        <w:t xml:space="preserve">Product Strategy, Product Roadmap, Go-to-Market (GTM) Strategy, A/B Testing, User Research, Customer Discovery, Sprint Planning, Agile, Scrum, Certified Scrum Master (CSM), Cross-Functional Team Leadership, Stakeholder Management, Technical Program Management, Product Requirements Document (PRD)</w:t>
+        <w:t xml:space="preserve">Product &amp; Program Management: </w:t>
+      </w:r>
+      <w:r>
+        <w:rPr>
+          <w:rFonts w:ascii="Calibri" w:cs="Calibri" w:eastAsia="Calibri" w:hAnsi="Calibri"/>
+          <w:color w:val="000000"/>
+          <w:sz w:val="20"/>
+          <w:szCs w:val="20"/>
+        </w:rPr>
+        <w:t xml:space="preserve">Product Strategy &amp; Roadmapping, Go-to-Market (GTM) Strategy, P&amp;L Ownership, Program Management, Cross-Functional Team Leadership, Stakeholder Management, Strategic Leadership, Team Mentoring, A/B Testing, User Research, Customer Discovery, Sprint Planning, Agile/Scrum, Certified Scrum Master (CSM), Technical Program Management, PRD, OKR Setting</w:t>
       </w:r>
     </w:p>
     <w:p>
@@ -220,16 +220,16 @@
           <w:sz w:val="20"/>
           <w:szCs w:val="20"/>
         </w:rPr>
-        <w:t xml:space="preserve">Hardware &amp; Semiconductor: </w:t>
-      </w:r>
-      <w:r>
-        <w:rPr>
-          <w:rFonts w:ascii="Calibri" w:cs="Calibri" w:eastAsia="Calibri" w:hAnsi="Calibri"/>
-          <w:color w:val="000000"/>
-          <w:sz w:val="20"/>
-          <w:szCs w:val="20"/>
-        </w:rPr>
-        <w:t xml:space="preserve">RF Engineering, 5G/6G/THz, mmWave, Antenna Design, Beamforming, S-Parameters, VNA, HFSS, Broadband Plasma Metrology, Wafer Fabrication, IC Packaging, CMOS, GaN, GaAs, PCB Design, FPGA, Embedded Systems, Semiconductor Testing</w:t>
+        <w:t xml:space="preserve">RF &amp; Hardware Engineering: </w:t>
+      </w:r>
+      <w:r>
+        <w:rPr>
+          <w:rFonts w:ascii="Calibri" w:cs="Calibri" w:eastAsia="Calibri" w:hAnsi="Calibri"/>
+          <w:color w:val="000000"/>
+          <w:sz w:val="20"/>
+          <w:szCs w:val="20"/>
+        </w:rPr>
+        <w:t xml:space="preserve">RF System Design, 5G/6G/THz, mmWave, Antenna Design, Beamforming, S-Parameters, VNA, HFSS, RF Filter Design, Amplifier Design, Mixer &amp; Frequency Conversion, CATV/DOCSIS Systems, EMI/EMC, Broadband Plasma Metrology, Wafer Fabrication, CMOS, GaN, GaAs, PCB Design, FPGA, Semiconductor Testing</w:t>
       </w:r>
     </w:p>
     <w:p>
@@ -318,7 +318,7 @@
           <w:sz w:val="21"/>
           <w:szCs w:val="21"/>
         </w:rPr>
-        <w:t xml:space="preserve">Applications Engineer II</w:t>
+        <w:t xml:space="preserve">Senior Product Manager / Senior Applications Engineer</w:t>
       </w:r>
       <w:r>
         <w:rPr>
@@ -371,64 +371,64 @@
           <w:sz w:val="20"/>
           <w:szCs w:val="20"/>
         </w:rPr>
-        <w:t xml:space="preserve">Launched 100+ RF and semiconductor products in 24 months across AI, DOCSIS 4.0, CATV, Core &amp; Wire, and 5G technology verticals, managing the complete product lifecycle from design to market launch</w:t>
-      </w:r>
-    </w:p>
-    <w:p>
-      <w:pPr>
-        <w:pStyle w:val="ListParagraph"/>
-        <w:numPr>
-          <w:ilvl w:val="0"/>
-          <w:numId w:val="2"/>
-        </w:numPr>
-        <w:spacing w:after="20"/>
-      </w:pPr>
-      <w:r>
-        <w:rPr>
-          <w:rFonts w:ascii="Calibri" w:cs="Calibri" w:eastAsia="Calibri" w:hAnsi="Calibri"/>
-          <w:color w:val="000000"/>
-          <w:sz w:val="20"/>
-          <w:szCs w:val="20"/>
-        </w:rPr>
-        <w:t xml:space="preserve">Sole owner of RF Core &amp; Wire product category within a 10,000+ SKU product portfolio; drove product strategy, roadmap prioritization, and cross-functional coordination with engineering, sales, and manufacturing teams</w:t>
-      </w:r>
-    </w:p>
-    <w:p>
-      <w:pPr>
-        <w:pStyle w:val="ListParagraph"/>
-        <w:numPr>
-          <w:ilvl w:val="0"/>
-          <w:numId w:val="2"/>
-        </w:numPr>
-        <w:spacing w:after="20"/>
-      </w:pPr>
-      <w:r>
-        <w:rPr>
-          <w:rFonts w:ascii="Calibri" w:cs="Calibri" w:eastAsia="Calibri" w:hAnsi="Calibri"/>
-          <w:color w:val="000000"/>
-          <w:sz w:val="20"/>
-          <w:szCs w:val="20"/>
-        </w:rPr>
-        <w:t xml:space="preserve">Led end-to-end product development including semiconductor manufacturing yield optimization, device characterization, and technical documentation across multiple product families</w:t>
-      </w:r>
-    </w:p>
-    <w:p>
-      <w:pPr>
-        <w:pStyle w:val="ListParagraph"/>
-        <w:numPr>
-          <w:ilvl w:val="0"/>
-          <w:numId w:val="2"/>
-        </w:numPr>
-        <w:spacing w:after="20"/>
-      </w:pPr>
-      <w:r>
-        <w:rPr>
-          <w:rFonts w:ascii="Calibri" w:cs="Calibri" w:eastAsia="Calibri" w:hAnsi="Calibri"/>
-          <w:color w:val="000000"/>
-          <w:sz w:val="20"/>
-          <w:szCs w:val="20"/>
-        </w:rPr>
-        <w:t xml:space="preserve">Managed customer engagements, technical product demos, and sales engineering partnerships; trained new hires and co-authored application notes driving product adoption</w:t>
+        <w:t xml:space="preserve">Launched 100+ RF and semiconductor products in 24 months across AI, DOCSIS 4.0, CATV, Core &amp; Wire, and 5G technology verticals, driving product strategy and roadmap execution from concept to market</w:t>
+      </w:r>
+    </w:p>
+    <w:p>
+      <w:pPr>
+        <w:pStyle w:val="ListParagraph"/>
+        <w:numPr>
+          <w:ilvl w:val="0"/>
+          <w:numId w:val="2"/>
+        </w:numPr>
+        <w:spacing w:after="20"/>
+      </w:pPr>
+      <w:r>
+        <w:rPr>
+          <w:rFonts w:ascii="Calibri" w:cs="Calibri" w:eastAsia="Calibri" w:hAnsi="Calibri"/>
+          <w:color w:val="000000"/>
+          <w:sz w:val="20"/>
+          <w:szCs w:val="20"/>
+        </w:rPr>
+        <w:t xml:space="preserve">Led cross-functional teams spanning R&amp;D, manufacturing, sales, and marketing to accelerate time-to-market; sole owner of RF Core &amp; Wire product category within a 10,000+ SKU portfolio, defining pricing, positioning, and customer engagement strategy</w:t>
+      </w:r>
+    </w:p>
+    <w:p>
+      <w:pPr>
+        <w:pStyle w:val="ListParagraph"/>
+        <w:numPr>
+          <w:ilvl w:val="0"/>
+          <w:numId w:val="2"/>
+        </w:numPr>
+        <w:spacing w:after="20"/>
+      </w:pPr>
+      <w:r>
+        <w:rPr>
+          <w:rFonts w:ascii="Calibri" w:cs="Calibri" w:eastAsia="Calibri" w:hAnsi="Calibri"/>
+          <w:color w:val="000000"/>
+          <w:sz w:val="20"/>
+          <w:szCs w:val="20"/>
+        </w:rPr>
+        <w:t xml:space="preserve">Mentored junior engineers and led training programs for new hires; drove strategic customer engagements with Tier-1 accounts through technical presentations and product roadmap discussions</w:t>
+      </w:r>
+    </w:p>
+    <w:p>
+      <w:pPr>
+        <w:pStyle w:val="ListParagraph"/>
+        <w:numPr>
+          <w:ilvl w:val="0"/>
+          <w:numId w:val="2"/>
+        </w:numPr>
+        <w:spacing w:after="20"/>
+      </w:pPr>
+      <w:r>
+        <w:rPr>
+          <w:rFonts w:ascii="Calibri" w:cs="Calibri" w:eastAsia="Calibri" w:hAnsi="Calibri"/>
+          <w:color w:val="000000"/>
+          <w:sz w:val="20"/>
+          <w:szCs w:val="20"/>
+        </w:rPr>
+        <w:t xml:space="preserve">Improved semiconductor manufacturing yield and RF design efficiency through data-driven process optimization; co-authored application notes and technical collateral for product adoption</w:t>
       </w:r>
     </w:p>
     <w:p>

</xml_diff>

<commit_message>
Expand resume projects: rename to PROJECTS, add all 12 with full descriptions
Replaced "SELECTED PROJECTS" + condensed "Additional Projects" line with
full bullet-point descriptions for all 12 projects including MarketPulse,
Molt Bot, Multilingual Salesman, Quantum Encrypted Call, and Founders Decoded.

Co-Authored-By: Claude Opus 4.6 <noreply@anthropic.com>
</commit_message>
<xml_diff>
--- a/Revanth_Kondaveti_Resume.docx
+++ b/Revanth_Kondaveti_Resume.docx
@@ -1089,7 +1089,7 @@
           <w:sz w:val="22"/>
           <w:szCs w:val="22"/>
         </w:rPr>
-        <w:t xml:space="preserve">SELECTED PROJECTS</w:t>
+        <w:t xml:space="preserve">PROJECTS</w:t>
       </w:r>
     </w:p>
     <w:p>
@@ -1304,16 +1304,152 @@
     </w:p>
     <w:p>
       <w:pPr>
-        <w:spacing w:after="40"/>
-      </w:pPr>
-      <w:r>
-        <w:rPr>
-          <w:rFonts w:ascii="Calibri" w:cs="Calibri" w:eastAsia="Calibri" w:hAnsi="Calibri"/>
-          <w:color w:val="000000"/>
-          <w:sz w:val="20"/>
-          <w:szCs w:val="20"/>
-        </w:rPr>
-        <w:t xml:space="preserve">Additional Projects: MarketPulse (real-time financial analytics platform), Molt Bot (privacy-first modular bot engine with on-device LLM), Telugu Salesman (multilingual AI sales agent), Quantum Encrypted Call (QKD-secured real-time communications), Founders Decoded (YouTube channel interviewing startup founders).</w:t>
+        <w:pStyle w:val="ListParagraph"/>
+        <w:numPr>
+          <w:ilvl w:val="0"/>
+          <w:numId w:val="2"/>
+        </w:numPr>
+        <w:spacing w:after="20"/>
+      </w:pPr>
+      <w:r>
+        <w:rPr>
+          <w:rFonts w:ascii="Calibri" w:cs="Calibri" w:eastAsia="Calibri" w:hAnsi="Calibri"/>
+          <w:b/>
+          <w:bCs/>
+          <w:color w:val="000000"/>
+          <w:sz w:val="20"/>
+          <w:szCs w:val="20"/>
+        </w:rPr>
+        <w:t xml:space="preserve">MarketPulse - Financial Markets Analytics: </w:t>
+      </w:r>
+      <w:r>
+        <w:rPr>
+          <w:rFonts w:ascii="Calibri" w:cs="Calibri" w:eastAsia="Calibri" w:hAnsi="Calibri"/>
+          <w:color w:val="000000"/>
+          <w:sz w:val="20"/>
+          <w:szCs w:val="20"/>
+        </w:rPr>
+        <w:t xml:space="preserve">Built real-time financial analytics platform with multi-source market data aggregation, technical indicator engine, sentiment analysis from news/social feeds, and interactive charting dashboard. Stack: Python, FastAPI, React, WebSocket.</w:t>
+      </w:r>
+    </w:p>
+    <w:p>
+      <w:pPr>
+        <w:pStyle w:val="ListParagraph"/>
+        <w:numPr>
+          <w:ilvl w:val="0"/>
+          <w:numId w:val="2"/>
+        </w:numPr>
+        <w:spacing w:after="20"/>
+      </w:pPr>
+      <w:r>
+        <w:rPr>
+          <w:rFonts w:ascii="Calibri" w:cs="Calibri" w:eastAsia="Calibri" w:hAnsi="Calibri"/>
+          <w:b/>
+          <w:bCs/>
+          <w:color w:val="000000"/>
+          <w:sz w:val="20"/>
+          <w:szCs w:val="20"/>
+        </w:rPr>
+        <w:t xml:space="preserve">Molt Bot - Privacy-First Modular Bot Engine: </w:t>
+      </w:r>
+      <w:r>
+        <w:rPr>
+          <w:rFonts w:ascii="Calibri" w:cs="Calibri" w:eastAsia="Calibri" w:hAnsi="Calibri"/>
+          <w:color w:val="000000"/>
+          <w:sz w:val="20"/>
+          <w:szCs w:val="20"/>
+        </w:rPr>
+        <w:t xml:space="preserve">Developed modular bot engine with on-device LLM inference, secure encrypted storage, plugin architecture for extensibility, and privacy-preserving conversation management. Stack: Python, Local LLM, SQLite.</w:t>
+      </w:r>
+    </w:p>
+    <w:p>
+      <w:pPr>
+        <w:pStyle w:val="ListParagraph"/>
+        <w:numPr>
+          <w:ilvl w:val="0"/>
+          <w:numId w:val="2"/>
+        </w:numPr>
+        <w:spacing w:after="20"/>
+      </w:pPr>
+      <w:r>
+        <w:rPr>
+          <w:rFonts w:ascii="Calibri" w:cs="Calibri" w:eastAsia="Calibri" w:hAnsi="Calibri"/>
+          <w:b/>
+          <w:bCs/>
+          <w:color w:val="000000"/>
+          <w:sz w:val="20"/>
+          <w:szCs w:val="20"/>
+        </w:rPr>
+        <w:t xml:space="preserve">Multilingual Salesman - AI Sales Agent: </w:t>
+      </w:r>
+      <w:r>
+        <w:rPr>
+          <w:rFonts w:ascii="Calibri" w:cs="Calibri" w:eastAsia="Calibri" w:hAnsi="Calibri"/>
+          <w:color w:val="000000"/>
+          <w:sz w:val="20"/>
+          <w:szCs w:val="20"/>
+        </w:rPr>
+        <w:t xml:space="preserve">Created AI-powered sales agent supporting 140+ languages with real-time translation, culturally-aware conversation flows, product knowledge retrieval, and CRM integration. Stack: Python, LLM APIs, FastAPI.</w:t>
+      </w:r>
+    </w:p>
+    <w:p>
+      <w:pPr>
+        <w:pStyle w:val="ListParagraph"/>
+        <w:numPr>
+          <w:ilvl w:val="0"/>
+          <w:numId w:val="2"/>
+        </w:numPr>
+        <w:spacing w:after="20"/>
+      </w:pPr>
+      <w:r>
+        <w:rPr>
+          <w:rFonts w:ascii="Calibri" w:cs="Calibri" w:eastAsia="Calibri" w:hAnsi="Calibri"/>
+          <w:b/>
+          <w:bCs/>
+          <w:color w:val="000000"/>
+          <w:sz w:val="20"/>
+          <w:szCs w:val="20"/>
+        </w:rPr>
+        <w:t xml:space="preserve">Quantum Encrypted Call: </w:t>
+      </w:r>
+      <w:r>
+        <w:rPr>
+          <w:rFonts w:ascii="Calibri" w:cs="Calibri" w:eastAsia="Calibri" w:hAnsi="Calibri"/>
+          <w:color w:val="000000"/>
+          <w:sz w:val="20"/>
+          <w:szCs w:val="20"/>
+        </w:rPr>
+        <w:t xml:space="preserve">Built quantum-secured real-time communication platform using Quantum Key Distribution (QKD) for end-to-end encrypted voice and video calls with post-quantum fallback algorithms. Stack: Python, WebRTC, QKD Simulation.</w:t>
+      </w:r>
+    </w:p>
+    <w:p>
+      <w:pPr>
+        <w:pStyle w:val="ListParagraph"/>
+        <w:numPr>
+          <w:ilvl w:val="0"/>
+          <w:numId w:val="2"/>
+        </w:numPr>
+        <w:spacing w:after="20"/>
+      </w:pPr>
+      <w:r>
+        <w:rPr>
+          <w:rFonts w:ascii="Calibri" w:cs="Calibri" w:eastAsia="Calibri" w:hAnsi="Calibri"/>
+          <w:b/>
+          <w:bCs/>
+          <w:color w:val="000000"/>
+          <w:sz w:val="20"/>
+          <w:szCs w:val="20"/>
+        </w:rPr>
+        <w:t xml:space="preserve">Founders Decoded - YouTube Channel &amp; Podcast: </w:t>
+      </w:r>
+      <w:r>
+        <w:rPr>
+          <w:rFonts w:ascii="Calibri" w:cs="Calibri" w:eastAsia="Calibri" w:hAnsi="Calibri"/>
+          <w:color w:val="000000"/>
+          <w:sz w:val="20"/>
+          <w:szCs w:val="20"/>
+        </w:rPr>
+        <w:t xml:space="preserve">Founded and hosted a YouTube channel interviewing startup founders, covering product development, fundraising, and scaling strategies with thought leadership in entrepreneurship and technology.</w:t>
       </w:r>
     </w:p>
     <w:p>

</xml_diff>

<commit_message>
Consolidate location lines into company name for all experience entries
Merged location (city, state) into the title/company line with "|" separator
across all 7 experience entries, reducing resume by 7 lines.

Co-Authored-By: Claude Opus 4.6 <noreply@anthropic.com>
</commit_message>
<xml_diff>
--- a/Revanth_Kondaveti_Resume.docx
+++ b/Revanth_Kondaveti_Resume.docx
@@ -327,7 +327,7 @@
           <w:sz w:val="21"/>
           <w:szCs w:val="21"/>
         </w:rPr>
-        <w:t xml:space="preserve"> | Mini-Circuits</w:t>
+        <w:t xml:space="preserve"> | Mini-Circuits | New York, NY</w:t>
       </w:r>
       <w:r>
         <w:rPr>
@@ -337,22 +337,6 @@
           <w:szCs w:val="20"/>
         </w:rPr>
         <w:t xml:space="preserve">	January 2024 - Present</w:t>
-      </w:r>
-    </w:p>
-    <w:p>
-      <w:pPr>
-        <w:spacing w:after="40" w:before="0"/>
-      </w:pPr>
-      <w:r>
-        <w:rPr>
-          <w:rFonts w:ascii="Calibri" w:cs="Calibri" w:eastAsia="Calibri" w:hAnsi="Calibri"/>
-          <w:i/>
-          <w:iCs/>
-          <w:color w:val="333333"/>
-          <w:sz w:val="19"/>
-          <w:szCs w:val="19"/>
-        </w:rPr>
-        <w:t xml:space="preserve">New York, NY</w:t>
       </w:r>
     </w:p>
     <w:p>
@@ -456,7 +440,7 @@
           <w:sz w:val="21"/>
           <w:szCs w:val="21"/>
         </w:rPr>
-        <w:t xml:space="preserve"> | Tap to Party</w:t>
+        <w:t xml:space="preserve"> | Tap to Party | California (Remote)</w:t>
       </w:r>
       <w:r>
         <w:rPr>
@@ -466,22 +450,6 @@
           <w:szCs w:val="20"/>
         </w:rPr>
         <w:t xml:space="preserve">	November 2023 - Present</w:t>
-      </w:r>
-    </w:p>
-    <w:p>
-      <w:pPr>
-        <w:spacing w:after="40" w:before="0"/>
-      </w:pPr>
-      <w:r>
-        <w:rPr>
-          <w:rFonts w:ascii="Calibri" w:cs="Calibri" w:eastAsia="Calibri" w:hAnsi="Calibri"/>
-          <w:i/>
-          <w:iCs/>
-          <w:color w:val="333333"/>
-          <w:sz w:val="19"/>
-          <w:szCs w:val="19"/>
-        </w:rPr>
-        <w:t xml:space="preserve">California (Remote)</w:t>
       </w:r>
     </w:p>
     <w:p>
@@ -566,7 +534,7 @@
           <w:sz w:val="21"/>
           <w:szCs w:val="21"/>
         </w:rPr>
-        <w:t xml:space="preserve"> | Ramsoft</w:t>
+        <w:t xml:space="preserve"> | Ramsoft | Texas</w:t>
       </w:r>
       <w:r>
         <w:rPr>
@@ -576,22 +544,6 @@
           <w:szCs w:val="20"/>
         </w:rPr>
         <w:t xml:space="preserve">	August 2023 - January 2024</w:t>
-      </w:r>
-    </w:p>
-    <w:p>
-      <w:pPr>
-        <w:spacing w:after="40" w:before="0"/>
-      </w:pPr>
-      <w:r>
-        <w:rPr>
-          <w:rFonts w:ascii="Calibri" w:cs="Calibri" w:eastAsia="Calibri" w:hAnsi="Calibri"/>
-          <w:i/>
-          <w:iCs/>
-          <w:color w:val="333333"/>
-          <w:sz w:val="19"/>
-          <w:szCs w:val="19"/>
-        </w:rPr>
-        <w:t xml:space="preserve">Texas</w:t>
       </w:r>
     </w:p>
     <w:p>
@@ -657,7 +609,7 @@
           <w:sz w:val="21"/>
           <w:szCs w:val="21"/>
         </w:rPr>
-        <w:t xml:space="preserve"> | KLA Corporation</w:t>
+        <w:t xml:space="preserve"> | KLA Corporation | Milpitas, CA</w:t>
       </w:r>
       <w:r>
         <w:rPr>
@@ -667,22 +619,6 @@
           <w:szCs w:val="20"/>
         </w:rPr>
         <w:t xml:space="preserve">	September 2022 - July 2023</w:t>
-      </w:r>
-    </w:p>
-    <w:p>
-      <w:pPr>
-        <w:spacing w:after="40" w:before="0"/>
-      </w:pPr>
-      <w:r>
-        <w:rPr>
-          <w:rFonts w:ascii="Calibri" w:cs="Calibri" w:eastAsia="Calibri" w:hAnsi="Calibri"/>
-          <w:i/>
-          <w:iCs/>
-          <w:color w:val="333333"/>
-          <w:sz w:val="19"/>
-          <w:szCs w:val="19"/>
-        </w:rPr>
-        <w:t xml:space="preserve">Milpitas, CA</w:t>
       </w:r>
     </w:p>
     <w:p>
@@ -767,7 +703,7 @@
           <w:sz w:val="21"/>
           <w:szCs w:val="21"/>
         </w:rPr>
-        <w:t xml:space="preserve"> | Meta - Reality Labs</w:t>
+        <w:t xml:space="preserve"> | Meta - Reality Labs | Sunnyvale, CA</w:t>
       </w:r>
       <w:r>
         <w:rPr>
@@ -777,22 +713,6 @@
           <w:szCs w:val="20"/>
         </w:rPr>
         <w:t xml:space="preserve">	April 2022 - September 2022</w:t>
-      </w:r>
-    </w:p>
-    <w:p>
-      <w:pPr>
-        <w:spacing w:after="40" w:before="0"/>
-      </w:pPr>
-      <w:r>
-        <w:rPr>
-          <w:rFonts w:ascii="Calibri" w:cs="Calibri" w:eastAsia="Calibri" w:hAnsi="Calibri"/>
-          <w:i/>
-          <w:iCs/>
-          <w:color w:val="333333"/>
-          <w:sz w:val="19"/>
-          <w:szCs w:val="19"/>
-        </w:rPr>
-        <w:t xml:space="preserve">Sunnyvale, CA</w:t>
       </w:r>
     </w:p>
     <w:p>
@@ -877,7 +797,7 @@
           <w:sz w:val="21"/>
           <w:szCs w:val="21"/>
         </w:rPr>
-        <w:t xml:space="preserve"> | WiDeS Lab, University of Southern California</w:t>
+        <w:t xml:space="preserve"> | WiDeS Lab, University of Southern California | Los Angeles, CA</w:t>
       </w:r>
       <w:r>
         <w:rPr>
@@ -887,22 +807,6 @@
           <w:szCs w:val="20"/>
         </w:rPr>
         <w:t xml:space="preserve">	August 2020 - April 2022</w:t>
-      </w:r>
-    </w:p>
-    <w:p>
-      <w:pPr>
-        <w:spacing w:after="40" w:before="0"/>
-      </w:pPr>
-      <w:r>
-        <w:rPr>
-          <w:rFonts w:ascii="Calibri" w:cs="Calibri" w:eastAsia="Calibri" w:hAnsi="Calibri"/>
-          <w:i/>
-          <w:iCs/>
-          <w:color w:val="333333"/>
-          <w:sz w:val="19"/>
-          <w:szCs w:val="19"/>
-        </w:rPr>
-        <w:t xml:space="preserve">Los Angeles, CA</w:t>
       </w:r>
     </w:p>
     <w:p>
@@ -987,7 +891,7 @@
           <w:sz w:val="21"/>
           <w:szCs w:val="21"/>
         </w:rPr>
-        <w:t xml:space="preserve"> | Levenson-Falk Lab, University of Southern California</w:t>
+        <w:t xml:space="preserve"> | Levenson-Falk Lab, University of Southern California | Los Angeles, CA</w:t>
       </w:r>
       <w:r>
         <w:rPr>
@@ -997,22 +901,6 @@
           <w:szCs w:val="20"/>
         </w:rPr>
         <w:t xml:space="preserve">	May 2021 - August 2021</w:t>
-      </w:r>
-    </w:p>
-    <w:p>
-      <w:pPr>
-        <w:spacing w:after="40" w:before="0"/>
-      </w:pPr>
-      <w:r>
-        <w:rPr>
-          <w:rFonts w:ascii="Calibri" w:cs="Calibri" w:eastAsia="Calibri" w:hAnsi="Calibri"/>
-          <w:i/>
-          <w:iCs/>
-          <w:color w:val="333333"/>
-          <w:sz w:val="19"/>
-          <w:szCs w:val="19"/>
-        </w:rPr>
-        <w:t xml:space="preserve">Los Angeles, CA</w:t>
       </w:r>
     </w:p>
     <w:p>

</xml_diff>